<commit_message>
Avance: Teoría de la Información
Terminada la tarea de: Canal Binario Simétrico
</commit_message>
<xml_diff>
--- a/Minería de datos/Práctica 8/Reporte - Práctica 8.docx
+++ b/Minería de datos/Práctica 8/Reporte - Práctica 8.docx
@@ -82,7 +82,25 @@
                                 <w:sz w:val="36"/>
                                 <w:szCs w:val="28"/>
                               </w:rPr>
-                              <w:t xml:space="preserve"> Enero – Junio 2026</w:t>
+                              <w:t xml:space="preserve"> Enero – </w:t>
+                            </w:r>
+                            <w:proofErr w:type="gramStart"/>
+                            <w:r>
+                              <w:rPr>
+                                <w:rFonts w:ascii="Bahnschrift Light" w:hAnsi="Bahnschrift Light" w:cs="Arial"/>
+                                <w:sz w:val="36"/>
+                                <w:szCs w:val="28"/>
+                              </w:rPr>
+                              <w:t>Junio</w:t>
+                            </w:r>
+                            <w:proofErr w:type="gramEnd"/>
+                            <w:r>
+                              <w:rPr>
+                                <w:rFonts w:ascii="Bahnschrift Light" w:hAnsi="Bahnschrift Light" w:cs="Arial"/>
+                                <w:sz w:val="36"/>
+                                <w:szCs w:val="28"/>
+                              </w:rPr>
+                              <w:t xml:space="preserve"> 2026</w:t>
                             </w:r>
                           </w:p>
                         </w:txbxContent>
@@ -135,7 +153,25 @@
                           <w:sz w:val="36"/>
                           <w:szCs w:val="28"/>
                         </w:rPr>
-                        <w:t xml:space="preserve"> Enero – Junio 2026</w:t>
+                        <w:t xml:space="preserve"> Enero – </w:t>
+                      </w:r>
+                      <w:proofErr w:type="gramStart"/>
+                      <w:r>
+                        <w:rPr>
+                          <w:rFonts w:ascii="Bahnschrift Light" w:hAnsi="Bahnschrift Light" w:cs="Arial"/>
+                          <w:sz w:val="36"/>
+                          <w:szCs w:val="28"/>
+                        </w:rPr>
+                        <w:t>Junio</w:t>
+                      </w:r>
+                      <w:proofErr w:type="gramEnd"/>
+                      <w:r>
+                        <w:rPr>
+                          <w:rFonts w:ascii="Bahnschrift Light" w:hAnsi="Bahnschrift Light" w:cs="Arial"/>
+                          <w:sz w:val="36"/>
+                          <w:szCs w:val="28"/>
+                        </w:rPr>
+                        <w:t xml:space="preserve"> 2026</w:t>
                       </w:r>
                     </w:p>
                   </w:txbxContent>
@@ -222,7 +258,7 @@
                                 <w:sz w:val="40"/>
                                 <w:szCs w:val="36"/>
                               </w:rPr>
-                              <w:t>7</w:t>
+                              <w:t>8</w:t>
                             </w:r>
                           </w:p>
                         </w:txbxContent>
@@ -276,7 +312,7 @@
                           <w:sz w:val="40"/>
                           <w:szCs w:val="36"/>
                         </w:rPr>
-                        <w:t>7</w:t>
+                        <w:t>8</w:t>
                       </w:r>
                     </w:p>
                   </w:txbxContent>
@@ -351,7 +387,7 @@
                                 <w:sz w:val="36"/>
                                 <w:szCs w:val="32"/>
                               </w:rPr>
-                              <w:t>Minería de secuencias y episodios</w:t>
+                              <w:t>Análisis predictivo</w:t>
                             </w:r>
                           </w:p>
                         </w:txbxContent>
@@ -393,7 +429,7 @@
                           <w:sz w:val="36"/>
                           <w:szCs w:val="32"/>
                         </w:rPr>
-                        <w:t>Minería de secuencias y episodios</w:t>
+                        <w:t>Análisis predictivo</w:t>
                       </w:r>
                     </w:p>
                   </w:txbxContent>
@@ -1672,7 +1708,7 @@
     </w:p>
     <w:p>
       <w:r>
-        <w:t>Utilizar el algoritmo de A Priori para encontrar patrones de secuencia y de episodio</w:t>
+        <w:t>Utilizar técnicas para análisis predictivo para minería de datos</w:t>
       </w:r>
     </w:p>
     <w:p>

</xml_diff>